<commit_message>
Video Link added to both Readme and Report
</commit_message>
<xml_diff>
--- a/MLOps_Assignment01_Report.docx
+++ b/MLOps_Assignment01_Report.docx
@@ -31,7 +31,7 @@
     </w:p>
     <w:p>
       <w:pPr>
-        <w:spacing w:after="400"/>
+        <w:spacing w:after="200"/>
       </w:pPr>
       <w:r>
         <w:rPr>
@@ -40,6 +40,52 @@
           <w:szCs w:val="22"/>
         </w:rPr>
         <w:t xml:space="preserve">Submitted by: Akash Kumar (2024AC05843)</w:t>
+      </w:r>
+    </w:p>
+    <w:p>
+      <w:pPr>
+        <w:spacing w:after="60"/>
+      </w:pPr>
+      <w:r>
+        <w:rPr>
+          <w:b/>
+          <w:bCs/>
+          <w:sz w:val="22"/>
+          <w:szCs w:val="22"/>
+        </w:rPr>
+        <w:t xml:space="preserve">Repository: </w:t>
+      </w:r>
+      <w:r>
+        <w:rPr>
+          <w:color w:val="1155CC"/>
+          <w:sz w:val="22"/>
+          <w:szCs w:val="22"/>
+          <w:u w:val="single"/>
+        </w:rPr>
+        <w:t xml:space="preserve">https://github.com/akashkt09/heart-disease-mlops</w:t>
+      </w:r>
+    </w:p>
+    <w:p>
+      <w:pPr>
+        <w:spacing w:after="400"/>
+      </w:pPr>
+      <w:r>
+        <w:rPr>
+          <w:b/>
+          <w:bCs/>
+          <w:sz w:val="22"/>
+          <w:szCs w:val="22"/>
+        </w:rPr>
+        <w:t xml:space="preserve">Video walkthrough: </w:t>
+      </w:r>
+      <w:r>
+        <w:rPr>
+          <w:color w:val="1155CC"/>
+          <w:sz w:val="22"/>
+          <w:szCs w:val="22"/>
+          <w:u w:val="single"/>
+        </w:rPr>
+        <w:t xml:space="preserve">https://drive.google.com/file/d/1MhbkQ0_a2Z-_CJTDWJIY0vbvNyxxJMFG/view?usp=share_link</w:t>
       </w:r>
     </w:p>
     <w:p>
@@ -2031,36 +2077,7 @@
         <w:spacing w:after="150" w:before="300"/>
       </w:pPr>
       <w:r>
-        <w:t xml:space="preserve">11. Repository</w:t>
-      </w:r>
-    </w:p>
-    <w:p>
-      <w:pPr>
-        <w:spacing w:after="120"/>
-      </w:pPr>
-      <w:r>
-        <w:t xml:space="preserve">The complete code, tests, Dockerfile, CI workflow, and Kubernetes manifest are available at:</w:t>
-      </w:r>
-    </w:p>
-    <w:p>
-      <w:pPr>
-        <w:spacing w:after="200" w:before="100"/>
-      </w:pPr>
-      <w:r>
-        <w:rPr>
-          <w:color w:val="1155CC"/>
-          <w:u w:val="single"/>
-        </w:rPr>
-        <w:t xml:space="preserve">https://github.com/akashkt09/heart-disease-mlops</w:t>
-      </w:r>
-    </w:p>
-    <w:p>
-      <w:pPr>
-        <w:pStyle w:val="Heading1"/>
-        <w:spacing w:after="150" w:before="300"/>
-      </w:pPr>
-      <w:r>
-        <w:t xml:space="preserve">12. Limitations &amp; Potential Improvements</w:t>
+        <w:t xml:space="preserve">11. Limitations &amp; Potential Improvements</w:t>
       </w:r>
     </w:p>
     <w:p>

</xml_diff>